<commit_message>
Bỏ notebook khỏi source, giữ pipeline train bằng Python
</commit_message>
<xml_diff>
--- a/docs/BAO_CAO_ANNOTAFLOW_VA_CAU_HOI_BAO_VE.docx
+++ b/docs/BAO_CAO_ANNOTAFLOW_VA_CAU_HOI_BAO_VE.docx
@@ -10035,10 +10035,7 @@
               <w:jc w:val="left"/>
             </w:pPr>
             <w:r>
-              <w:rPr>
-                <w:sz w:val="20"/>
-              </w:rPr>
-              <w:t>training/​ và notebooks/​training/​</w:t>
+              <w:t>training/</w:t>
             </w:r>
           </w:p>
         </w:tc>
@@ -10059,10 +10056,7 @@
               <w:jc w:val="left"/>
             </w:pPr>
             <w:r>
-              <w:rPr>
-                <w:sz w:val="20"/>
-              </w:rPr>
-              <w:t>Script train/​eval, cấu hình, hồ sơ nhập, wrapper thực nghiệm và notebook</w:t>
+              <w:t>Script train/eval, cấu hình, hồ sơ nhập và wrapper thực nghiệm</w:t>
             </w:r>
           </w:p>
         </w:tc>
@@ -16400,7 +16394,7 @@
     </w:p>
     <w:p>
       <w:r>
-        <w:t>Tại thời điểm lập tài liệu, import_manifest ghi training_execution_verified=false và chưa có thư mục training/evidence/runs. Notebook được nhập chưa có output thực thi. Vì vậy câu nói phù hợp là: “Source hiện đã tích hợp dữ liệu, mã huấn luyện, cấu hình, trọng số và báo cáo của ba model; để chứng minh đã train trên máy này từ commit cụ thể cần chạy và lưu manifest/log thật.” Không thể tạo bằng chứng lịch sử chỉ bằng sao chép tệp hoặc đổi ngày tháng.</w:t>
+        <w:t>Tại thời điểm lập tài liệu, import_manifest ghi training_execution_verified=false và chưa có thư mục training/evidence/runs. Notebook đã được bỏ khỏi source; chưa có log xác minh lần train lịch sử. Vì vậy câu nói phù hợp là: “Source hiện đã tích hợp dữ liệu, mã huấn luyện, cấu hình, trọng số và báo cáo của ba model; để chứng minh đã train trên máy này từ commit cụ thể cần chạy và lưu manifest/log thật.” Không thể tạo bằng chứng lịch sử chỉ bằng sao chép tệp hoặc đổi ngày tháng.</w:t>
       </w:r>
     </w:p>
     <w:p>

</xml_diff>